<commit_message>
Labels: reference the controlled label-template document; example-label spaces
WHSOP_003_A03 §2–3 no longer act as the label template. §2 lists, per label
type (pallet, carton, retention-sample container, sample carton RS), its
mandatory content and the code and version of the controlled template
document it is printed from, with N/A and a justification line. §3 gives a
marked space for a specimen of each label. SOP 6.4.3 / 6.4.6 and checklist
A13 point to them.

Engine: [[BOX:<cm>]] ... [[/BOX]] — a dashed, captioned space of a minimum
height, empty or with content.

Worked example: template codes left as [ ] to enter; each box shows the T1/T2
label content in the bracket colours.

Co-Authored-By: Claude Opus 5.5 <noreply@anthropic.com>
Claude-Session: https://claude.ai/code/session_01Fszd7nMMPhqDmBiyiM2Bec
</commit_message>
<xml_diff>
--- a/deliverables/inland_transport_2026-10/docx/WHSOP_003.docx
+++ b/deliverables/inland_transport_2026-10/docx/WHSOP_003.docx
@@ -8320,7 +8320,7 @@
                 <w:color w:val="000000"/>
                 <w:sz w:val="22"/>
               </w:rPr>
-              <w:t>6.4.3 Етикети (систем на хартија, без бар-кодови и скенери): етикетите се печатат од контролираниот образец WHSOP_003_A03, со големи читливи знаци; етикетата на палетата се става во проѕирна плика на две соседни страни на надворешното завиткување. Пред лепење, второ лице ги споредува етикетите со листите на пакување и го потпишува тоа. Корекциите се прават според добрата документациска пракса (една линија, иницијали, датум); испишана етикета не се пребришува — се печати нова, а погрешната се поништува и се чува.</w:t>
+              <w:t>6.4.3 Етикети (систем на хартија, без бар-кодови и скенери): етикетите се печатат од контролираниот документ — образец за етикети, чиј код и верзија се запишуваат во WHSOP_003_A03 §2 (N/A со образложение, ако за видот етикета нема посебен образец), со големи читливи знаци; по еден примерок од секој вид етикета се лепи во A03 §3; етикетата на палетата се става во проѕирна плика на две соседни страни на надворешното завиткување. Пред лепење, второ лице ги споредува етикетите со листите на пакување и го потпишува тоа. Корекциите се прават според добрата документациска пракса (една линија, иницијали, датум); испишана етикета не се пребришува — се печати нова, а погрешната се поништува и се чува.</w:t>
             </w:r>
           </w:p>
         </w:tc>
@@ -8348,7 +8348,7 @@
                 <w:color w:val="595959"/>
                 <w:sz w:val="22"/>
               </w:rPr>
-              <w:t>6.4.3 Labels (paper-based system, no barcodes or scanners): labels are printed from the controlled template WHSOP_003_A03, in large legible characters; the pallet label is placed in a clear pouch on two adjacent sides of the outer wrap. Before application, a second person compares the labels with the packing lists and signs for it. Corrections follow good documentation practice (single line, initials, date); a printed label is never overwritten — a new one is printed and the wrong one is voided and retained.</w:t>
+              <w:t>6.4.3 Labels (paper-based system, no barcodes or scanners): labels are printed from the controlled label-template document whose code and version are recorded in WHSOP_003_A03 §2 (N/A with justification where a label type has no separate template), in large legible characters; one specimen of each label type is affixed in A03 §3; the pallet label is placed in a clear pouch on two adjacent sides of the outer wrap. Before application, a second person compares the labels with the packing lists and signs for it. Corrections follow good documentation practice (single line, initials, date); a printed label is never overwritten — a new one is printed and the wrong one is voided and retained.</w:t>
             </w:r>
           </w:p>
         </w:tc>
@@ -8494,7 +8494,7 @@
                 <w:color w:val="000000"/>
                 <w:sz w:val="22"/>
               </w:rPr>
-              <w:t>6.4.6 Ретенциони мостри за купувачот и за продавачот на мало: КК ги подготвува според договорот (број и маса по серија), секоја во запечатен контејнер означен со серијата, P серијата, нето масата, примачот на мострата (купувач / продавач на мало), датумот и „РЕТЕНЦИОНА МОСТРА“; ги евидентира во листата на ретенциони мостри (WHSOP_003_A03 §7) со двојна проверка. Мострите се ставаат во посебен картон за мостри (UTID-RS), затворен со безбедносна лента и означен како картон, кој се товари во товарниот простор и се брои на секоја точка на предавање. Бројот и масата на мострите се вклучени во вкупната количина во A02, A04 и A06.</w:t>
+              <w:t>6.4.6 Ретенциони мостри за купувачот и за продавачот на мало: КК ги подготвува според договорот (број и маса по серија), секоја во запечатен контејнер со етикета од образецот наведен во A03 §2, означен со серијата, P серијата, нето масата, примачот на мострата (купувач / продавач на мало), датумот и „РЕТЕНЦИОНА МОСТРА“; ги евидентира во листата на ретенциони мостри (WHSOP_003_A03 §7) со двојна проверка. Мострите се ставаат во посебен картон за мостри (UTID-RS), затворен со безбедносна лента и означен како картон, кој се товари во товарниот простор и се брои на секоја точка на предавање. Бројот и масата на мострите се вклучени во вкупната количина во A02, A04 и A06.</w:t>
             </w:r>
           </w:p>
         </w:tc>
@@ -8522,7 +8522,7 @@
                 <w:color w:val="595959"/>
                 <w:sz w:val="22"/>
               </w:rPr>
-              <w:t>6.4.6 Retention samples for the buyer and the retailer: QC prepares them per the contract (number and mass per batch), each in a sealed container labelled with the batch, the P lot, the net mass, the sample recipient (buyer / retailer), the date and "RETENTION SAMPLE"; it records them in the retention-sample list (WHSOP_003_A03 §7) with two-person verification. The samples are placed in a separate sample carton (UTID-RS), closed with security tape and labelled as a carton, which is loaded in the load space and counted at every transfer point. The number and mass of the samples are included in the total quantity in A02, A04 and A06.</w:t>
+              <w:t>6.4.6 Retention samples for the buyer and the retailer: QC prepares them per the contract (number and mass per batch), each in a sealed container with a label from the template listed in A03 §2, showing the batch, the P lot, the net mass, the sample recipient (buyer / retailer), the date and "RETENTION SAMPLE"; it records them in the retention-sample list (WHSOP_003_A03 §7) with two-person verification. The samples are placed in a separate sample carton (UTID-RS), closed with security tape and labelled as a carton, which is loaded in the load space and counted at every transfer point. The number and mass of the samples are included in the total quantity in A02, A04 and A06.</w:t>
             </w:r>
           </w:p>
         </w:tc>

</xml_diff>